<commit_message>
Rename app and prepare visual journey
</commit_message>
<xml_diff>
--- a/SP_App_Tech_Stack_and_Phase_1_Plan.docx
+++ b/SP_App_Tech_Stack_and_Phase_1_Plan.docx
@@ -27,7 +27,7 @@
           <w:color w:val="5C697A"/>
           <w:sz w:val="25"/>
         </w:rPr>
-        <w:t>SP App / Sleep Paralysis Companion - iOS-first MVP with Apple Watch and Android planned from day one</w:t>
+        <w:t>Sleep Paralysis Companion - iOS-first MVP with Apple Watch and Android planned from day one</w:t>
       </w:r>
     </w:p>
     <w:p>
@@ -4921,7 +4921,7 @@
         <w:color w:val="5C697A"/>
         <w:sz w:val="18"/>
       </w:rPr>
-      <w:t>SP App Technical Plan</w:t>
+      <w:t>Sleep Paralysis Companion Technical Plan</w:t>
     </w:r>
   </w:p>
 </w:hdr>

</xml_diff>